<commit_message>
fix(paper): completely remove 9th column Joint EM from Table 8 XML in Paper V26
</commit_message>
<xml_diff>
--- a/docs/paper/PaperV26_Ollama_Primary.docx
+++ b/docs/paper/PaperV26_Ollama_Primary.docx
@@ -13424,7 +13424,6 @@
         <w:gridCol w:w="1040"/>
         <w:gridCol w:w="1040"/>
         <w:gridCol w:w="1040"/>
-        <w:gridCol w:w="1040"/>
       </w:tblGrid>
       <w:tr>
         <w:tc>
@@ -13444,11 +13443,17 @@
               <w:right w:w="35" w:type="dxa"/>
             </w:tcMar>
             <w:shd w:fill="1B365D"/>
-          </w:tcPr>
-          <w:p>
-            <w:pPr>
-              <w:spacing w:before="20" w:after="20" w:line="240" w:lineRule="auto"/>
-              <w:jc w:val="left"/>
+            <w:tcMar>
+              <w:top w:w="28" w:type="dxa"/>
+              <w:bottom w:w="28" w:type="dxa"/>
+              <w:left w:w="35" w:type="dxa"/>
+              <w:right w:w="35" w:type="dxa"/>
+            </w:tcMar>
+            <w:shd w:fill="1B365D"/>
+          </w:tcPr>
+          <w:p>
+            <w:pPr>
+              <w:spacing w:before="20" w:after="20" w:line="240" w:lineRule="auto"/>
             </w:pPr>
             <w:r>
               <w:rPr>
@@ -13478,11 +13483,17 @@
               <w:right w:w="35" w:type="dxa"/>
             </w:tcMar>
             <w:shd w:fill="1B365D"/>
-          </w:tcPr>
-          <w:p>
-            <w:pPr>
-              <w:spacing w:before="20" w:after="20" w:line="240" w:lineRule="auto"/>
-              <w:jc w:val="center"/>
+            <w:tcMar>
+              <w:top w:w="28" w:type="dxa"/>
+              <w:bottom w:w="28" w:type="dxa"/>
+              <w:left w:w="35" w:type="dxa"/>
+              <w:right w:w="35" w:type="dxa"/>
+            </w:tcMar>
+            <w:shd w:fill="1B365D"/>
+          </w:tcPr>
+          <w:p>
+            <w:pPr>
+              <w:spacing w:before="20" w:after="20" w:line="240" w:lineRule="auto"/>
             </w:pPr>
             <w:r>
               <w:rPr>
@@ -13512,11 +13523,17 @@
               <w:right w:w="35" w:type="dxa"/>
             </w:tcMar>
             <w:shd w:fill="1B365D"/>
-          </w:tcPr>
-          <w:p>
-            <w:pPr>
-              <w:spacing w:before="20" w:after="20" w:line="240" w:lineRule="auto"/>
-              <w:jc w:val="center"/>
+            <w:tcMar>
+              <w:top w:w="28" w:type="dxa"/>
+              <w:bottom w:w="28" w:type="dxa"/>
+              <w:left w:w="35" w:type="dxa"/>
+              <w:right w:w="35" w:type="dxa"/>
+            </w:tcMar>
+            <w:shd w:fill="1B365D"/>
+          </w:tcPr>
+          <w:p>
+            <w:pPr>
+              <w:spacing w:before="20" w:after="20" w:line="240" w:lineRule="auto"/>
             </w:pPr>
             <w:r>
               <w:rPr>
@@ -13546,11 +13563,17 @@
               <w:right w:w="35" w:type="dxa"/>
             </w:tcMar>
             <w:shd w:fill="1B365D"/>
-          </w:tcPr>
-          <w:p>
-            <w:pPr>
-              <w:spacing w:before="20" w:after="20" w:line="240" w:lineRule="auto"/>
-              <w:jc w:val="center"/>
+            <w:tcMar>
+              <w:top w:w="28" w:type="dxa"/>
+              <w:bottom w:w="28" w:type="dxa"/>
+              <w:left w:w="35" w:type="dxa"/>
+              <w:right w:w="35" w:type="dxa"/>
+            </w:tcMar>
+            <w:shd w:fill="1B365D"/>
+          </w:tcPr>
+          <w:p>
+            <w:pPr>
+              <w:spacing w:before="20" w:after="20" w:line="240" w:lineRule="auto"/>
             </w:pPr>
             <w:r>
               <w:rPr>
@@ -13580,11 +13603,17 @@
               <w:right w:w="35" w:type="dxa"/>
             </w:tcMar>
             <w:shd w:fill="1B365D"/>
-          </w:tcPr>
-          <w:p>
-            <w:pPr>
-              <w:spacing w:before="20" w:after="20" w:line="240" w:lineRule="auto"/>
-              <w:jc w:val="center"/>
+            <w:tcMar>
+              <w:top w:w="28" w:type="dxa"/>
+              <w:bottom w:w="28" w:type="dxa"/>
+              <w:left w:w="35" w:type="dxa"/>
+              <w:right w:w="35" w:type="dxa"/>
+            </w:tcMar>
+            <w:shd w:fill="1B365D"/>
+          </w:tcPr>
+          <w:p>
+            <w:pPr>
+              <w:spacing w:before="20" w:after="20" w:line="240" w:lineRule="auto"/>
             </w:pPr>
             <w:r>
               <w:rPr>
@@ -13614,11 +13643,17 @@
               <w:right w:w="35" w:type="dxa"/>
             </w:tcMar>
             <w:shd w:fill="1B365D"/>
-          </w:tcPr>
-          <w:p>
-            <w:pPr>
-              <w:spacing w:before="20" w:after="20" w:line="240" w:lineRule="auto"/>
-              <w:jc w:val="center"/>
+            <w:tcMar>
+              <w:top w:w="28" w:type="dxa"/>
+              <w:bottom w:w="28" w:type="dxa"/>
+              <w:left w:w="35" w:type="dxa"/>
+              <w:right w:w="35" w:type="dxa"/>
+            </w:tcMar>
+            <w:shd w:fill="1B365D"/>
+          </w:tcPr>
+          <w:p>
+            <w:pPr>
+              <w:spacing w:before="20" w:after="20" w:line="240" w:lineRule="auto"/>
             </w:pPr>
             <w:r>
               <w:rPr>
@@ -13648,11 +13683,17 @@
               <w:right w:w="35" w:type="dxa"/>
             </w:tcMar>
             <w:shd w:fill="1B365D"/>
-          </w:tcPr>
-          <w:p>
-            <w:pPr>
-              <w:spacing w:before="20" w:after="20" w:line="240" w:lineRule="auto"/>
-              <w:jc w:val="center"/>
+            <w:tcMar>
+              <w:top w:w="28" w:type="dxa"/>
+              <w:bottom w:w="28" w:type="dxa"/>
+              <w:left w:w="35" w:type="dxa"/>
+              <w:right w:w="35" w:type="dxa"/>
+            </w:tcMar>
+            <w:shd w:fill="1B365D"/>
+          </w:tcPr>
+          <w:p>
+            <w:pPr>
+              <w:spacing w:before="20" w:after="20" w:line="240" w:lineRule="auto"/>
             </w:pPr>
             <w:r>
               <w:rPr>
@@ -13682,11 +13723,17 @@
               <w:right w:w="35" w:type="dxa"/>
             </w:tcMar>
             <w:shd w:fill="1B365D"/>
-          </w:tcPr>
-          <w:p>
-            <w:pPr>
-              <w:spacing w:before="20" w:after="20" w:line="240" w:lineRule="auto"/>
-              <w:jc w:val="center"/>
+            <w:tcMar>
+              <w:top w:w="28" w:type="dxa"/>
+              <w:bottom w:w="28" w:type="dxa"/>
+              <w:left w:w="35" w:type="dxa"/>
+              <w:right w:w="35" w:type="dxa"/>
+            </w:tcMar>
+            <w:shd w:fill="1B365D"/>
+          </w:tcPr>
+          <w:p>
+            <w:pPr>
+              <w:spacing w:before="20" w:after="20" w:line="240" w:lineRule="auto"/>
             </w:pPr>
             <w:r>
               <w:rPr>
@@ -13699,40 +13746,6 @@
             </w:r>
           </w:p>
         </w:tc>
-        <w:tc>
-          <w:tcPr>
-            <w:tcW w:type="dxa" w:w="1152"/>
-            <w:tcMar>
-              <w:top w:w="35" w:type="dxa"/>
-              <w:bottom w:w="35" w:type="dxa"/>
-              <w:left w:w="45" w:type="dxa"/>
-              <w:right w:w="45" w:type="dxa"/>
-            </w:tcMar>
-            <w:shd w:fill="E0E0E0"/>
-            <w:tcMar>
-              <w:top w:w="28" w:type="dxa"/>
-              <w:bottom w:w="28" w:type="dxa"/>
-              <w:left w:w="35" w:type="dxa"/>
-              <w:right w:w="35" w:type="dxa"/>
-            </w:tcMar>
-            <w:shd w:fill="1B365D"/>
-          </w:tcPr>
-          <w:p>
-            <w:pPr>
-              <w:spacing w:line="240" w:lineRule="auto" w:before="20" w:after="20"/>
-              <w:jc w:val="center"/>
-            </w:pPr>
-            <w:r>
-              <w:rPr>
-                <w:rFonts w:ascii="Times New Roman" w:hAnsi="Times New Roman"/>
-                <w:b/>
-                <w:color w:val="FFFFFF"/>
-                <w:sz w:val="16"/>
-              </w:rPr>
-              <w:t>Joint Record EM</w:t>
-            </w:r>
-          </w:p>
-        </w:tc>
       </w:tr>
       <w:tr>
         <w:tc>
@@ -13752,16 +13765,21 @@
               <w:right w:w="35" w:type="dxa"/>
             </w:tcMar>
             <w:shd w:fill="F7FAFC"/>
-          </w:tcPr>
-          <w:p>
-            <w:pPr>
-              <w:spacing w:before="20" w:after="20" w:line="240" w:lineRule="auto"/>
-              <w:jc w:val="left"/>
-            </w:pPr>
-            <w:r>
-              <w:rPr>
-                <w:rFonts w:ascii="Times New Roman" w:hAnsi="Times New Roman"/>
-                <w:b/>
+            <w:tcMar>
+              <w:top w:w="28" w:type="dxa"/>
+              <w:bottom w:w="28" w:type="dxa"/>
+              <w:left w:w="35" w:type="dxa"/>
+              <w:right w:w="35" w:type="dxa"/>
+            </w:tcMar>
+            <w:shd w:fill="F7FAFC"/>
+          </w:tcPr>
+          <w:p>
+            <w:pPr>
+              <w:spacing w:before="20" w:after="20" w:line="240" w:lineRule="auto"/>
+            </w:pPr>
+            <w:r>
+              <w:rPr>
+                <w:rFonts w:ascii="Times New Roman" w:hAnsi="Times New Roman"/>
                 <w:color w:val="1E293B"/>
                 <w:sz w:val="14"/>
               </w:rPr>
@@ -13786,11 +13804,17 @@
               <w:right w:w="35" w:type="dxa"/>
             </w:tcMar>
             <w:shd w:fill="F7FAFC"/>
-          </w:tcPr>
-          <w:p>
-            <w:pPr>
-              <w:spacing w:before="20" w:after="20" w:line="240" w:lineRule="auto"/>
-              <w:jc w:val="center"/>
+            <w:tcMar>
+              <w:top w:w="28" w:type="dxa"/>
+              <w:bottom w:w="28" w:type="dxa"/>
+              <w:left w:w="35" w:type="dxa"/>
+              <w:right w:w="35" w:type="dxa"/>
+            </w:tcMar>
+            <w:shd w:fill="F7FAFC"/>
+          </w:tcPr>
+          <w:p>
+            <w:pPr>
+              <w:spacing w:before="20" w:after="20" w:line="240" w:lineRule="auto"/>
             </w:pPr>
             <w:r>
               <w:rPr>
@@ -13819,11 +13843,17 @@
               <w:right w:w="35" w:type="dxa"/>
             </w:tcMar>
             <w:shd w:fill="F7FAFC"/>
-          </w:tcPr>
-          <w:p>
-            <w:pPr>
-              <w:spacing w:before="20" w:after="20" w:line="240" w:lineRule="auto"/>
-              <w:jc w:val="center"/>
+            <w:tcMar>
+              <w:top w:w="28" w:type="dxa"/>
+              <w:bottom w:w="28" w:type="dxa"/>
+              <w:left w:w="35" w:type="dxa"/>
+              <w:right w:w="35" w:type="dxa"/>
+            </w:tcMar>
+            <w:shd w:fill="F7FAFC"/>
+          </w:tcPr>
+          <w:p>
+            <w:pPr>
+              <w:spacing w:before="20" w:after="20" w:line="240" w:lineRule="auto"/>
             </w:pPr>
             <w:r>
               <w:rPr>
@@ -13852,11 +13882,17 @@
               <w:right w:w="35" w:type="dxa"/>
             </w:tcMar>
             <w:shd w:fill="F7FAFC"/>
-          </w:tcPr>
-          <w:p>
-            <w:pPr>
-              <w:spacing w:before="20" w:after="20" w:line="240" w:lineRule="auto"/>
-              <w:jc w:val="center"/>
+            <w:tcMar>
+              <w:top w:w="28" w:type="dxa"/>
+              <w:bottom w:w="28" w:type="dxa"/>
+              <w:left w:w="35" w:type="dxa"/>
+              <w:right w:w="35" w:type="dxa"/>
+            </w:tcMar>
+            <w:shd w:fill="F7FAFC"/>
+          </w:tcPr>
+          <w:p>
+            <w:pPr>
+              <w:spacing w:before="20" w:after="20" w:line="240" w:lineRule="auto"/>
             </w:pPr>
             <w:r>
               <w:rPr>
@@ -13885,11 +13921,17 @@
               <w:right w:w="35" w:type="dxa"/>
             </w:tcMar>
             <w:shd w:fill="F7FAFC"/>
-          </w:tcPr>
-          <w:p>
-            <w:pPr>
-              <w:spacing w:before="20" w:after="20" w:line="240" w:lineRule="auto"/>
-              <w:jc w:val="center"/>
+            <w:tcMar>
+              <w:top w:w="28" w:type="dxa"/>
+              <w:bottom w:w="28" w:type="dxa"/>
+              <w:left w:w="35" w:type="dxa"/>
+              <w:right w:w="35" w:type="dxa"/>
+            </w:tcMar>
+            <w:shd w:fill="F7FAFC"/>
+          </w:tcPr>
+          <w:p>
+            <w:pPr>
+              <w:spacing w:before="20" w:after="20" w:line="240" w:lineRule="auto"/>
             </w:pPr>
             <w:r>
               <w:rPr>
@@ -13918,11 +13960,17 @@
               <w:right w:w="35" w:type="dxa"/>
             </w:tcMar>
             <w:shd w:fill="F7FAFC"/>
-          </w:tcPr>
-          <w:p>
-            <w:pPr>
-              <w:spacing w:before="20" w:after="20" w:line="240" w:lineRule="auto"/>
-              <w:jc w:val="center"/>
+            <w:tcMar>
+              <w:top w:w="28" w:type="dxa"/>
+              <w:bottom w:w="28" w:type="dxa"/>
+              <w:left w:w="35" w:type="dxa"/>
+              <w:right w:w="35" w:type="dxa"/>
+            </w:tcMar>
+            <w:shd w:fill="F7FAFC"/>
+          </w:tcPr>
+          <w:p>
+            <w:pPr>
+              <w:spacing w:before="20" w:after="20" w:line="240" w:lineRule="auto"/>
             </w:pPr>
             <w:r>
               <w:rPr>
@@ -13951,11 +13999,17 @@
               <w:right w:w="35" w:type="dxa"/>
             </w:tcMar>
             <w:shd w:fill="F7FAFC"/>
-          </w:tcPr>
-          <w:p>
-            <w:pPr>
-              <w:spacing w:before="20" w:after="20" w:line="240" w:lineRule="auto"/>
-              <w:jc w:val="center"/>
+            <w:tcMar>
+              <w:top w:w="28" w:type="dxa"/>
+              <w:bottom w:w="28" w:type="dxa"/>
+              <w:left w:w="35" w:type="dxa"/>
+              <w:right w:w="35" w:type="dxa"/>
+            </w:tcMar>
+            <w:shd w:fill="F7FAFC"/>
+          </w:tcPr>
+          <w:p>
+            <w:pPr>
+              <w:spacing w:before="20" w:after="20" w:line="240" w:lineRule="auto"/>
             </w:pPr>
             <w:r>
               <w:rPr>
@@ -13984,11 +14038,17 @@
               <w:right w:w="35" w:type="dxa"/>
             </w:tcMar>
             <w:shd w:fill="F7FAFC"/>
-          </w:tcPr>
-          <w:p>
-            <w:pPr>
-              <w:spacing w:before="20" w:after="20" w:line="240" w:lineRule="auto"/>
-              <w:jc w:val="center"/>
+            <w:tcMar>
+              <w:top w:w="28" w:type="dxa"/>
+              <w:bottom w:w="28" w:type="dxa"/>
+              <w:left w:w="35" w:type="dxa"/>
+              <w:right w:w="35" w:type="dxa"/>
+            </w:tcMar>
+            <w:shd w:fill="F7FAFC"/>
+          </w:tcPr>
+          <w:p>
+            <w:pPr>
+              <w:spacing w:before="20" w:after="20" w:line="240" w:lineRule="auto"/>
             </w:pPr>
             <w:r>
               <w:rPr>
@@ -13997,39 +14057,6 @@
                 <w:sz w:val="14"/>
               </w:rPr>
               <w:t>Fails completely on raster images</w:t>
-            </w:r>
-          </w:p>
-        </w:tc>
-        <w:tc>
-          <w:tcPr>
-            <w:tcW w:type="dxa" w:w="1152"/>
-            <w:tcMar>
-              <w:top w:w="35" w:type="dxa"/>
-              <w:bottom w:w="35" w:type="dxa"/>
-              <w:left w:w="45" w:type="dxa"/>
-              <w:right w:w="45" w:type="dxa"/>
-            </w:tcMar>
-            <w:shd w:fill="F8F9FA"/>
-            <w:tcMar>
-              <w:top w:w="28" w:type="dxa"/>
-              <w:bottom w:w="28" w:type="dxa"/>
-              <w:left w:w="35" w:type="dxa"/>
-              <w:right w:w="35" w:type="dxa"/>
-            </w:tcMar>
-            <w:shd w:fill="F7FAFC"/>
-          </w:tcPr>
-          <w:p>
-            <w:pPr>
-              <w:spacing w:line="240" w:lineRule="auto" w:before="20" w:after="20"/>
-              <w:jc w:val="center"/>
-            </w:pPr>
-            <w:r>
-              <w:rPr>
-                <w:rFonts w:ascii="Times New Roman" w:hAnsi="Times New Roman"/>
-                <w:color w:val="1E293B"/>
-                <w:sz w:val="14"/>
-              </w:rPr>
-              <w:t>0.00%</w:t>
             </w:r>
           </w:p>
         </w:tc>
@@ -14051,16 +14078,21 @@
               <w:right w:w="35" w:type="dxa"/>
             </w:tcMar>
             <w:shd w:fill="FFFFFF"/>
-          </w:tcPr>
-          <w:p>
-            <w:pPr>
-              <w:spacing w:before="20" w:after="20" w:line="240" w:lineRule="auto"/>
-              <w:jc w:val="left"/>
-            </w:pPr>
-            <w:r>
-              <w:rPr>
-                <w:rFonts w:ascii="Times New Roman" w:hAnsi="Times New Roman"/>
-                <w:b/>
+            <w:tcMar>
+              <w:top w:w="28" w:type="dxa"/>
+              <w:bottom w:w="28" w:type="dxa"/>
+              <w:left w:w="35" w:type="dxa"/>
+              <w:right w:w="35" w:type="dxa"/>
+            </w:tcMar>
+            <w:shd w:fill="FFFFFF"/>
+          </w:tcPr>
+          <w:p>
+            <w:pPr>
+              <w:spacing w:before="20" w:after="20" w:line="240" w:lineRule="auto"/>
+            </w:pPr>
+            <w:r>
+              <w:rPr>
+                <w:rFonts w:ascii="Times New Roman" w:hAnsi="Times New Roman"/>
                 <w:color w:val="1E293B"/>
                 <w:sz w:val="14"/>
               </w:rPr>
@@ -14084,11 +14116,17 @@
               <w:right w:w="35" w:type="dxa"/>
             </w:tcMar>
             <w:shd w:fill="FFFFFF"/>
-          </w:tcPr>
-          <w:p>
-            <w:pPr>
-              <w:spacing w:before="20" w:after="20" w:line="240" w:lineRule="auto"/>
-              <w:jc w:val="center"/>
+            <w:tcMar>
+              <w:top w:w="28" w:type="dxa"/>
+              <w:bottom w:w="28" w:type="dxa"/>
+              <w:left w:w="35" w:type="dxa"/>
+              <w:right w:w="35" w:type="dxa"/>
+            </w:tcMar>
+            <w:shd w:fill="FFFFFF"/>
+          </w:tcPr>
+          <w:p>
+            <w:pPr>
+              <w:spacing w:before="20" w:after="20" w:line="240" w:lineRule="auto"/>
             </w:pPr>
             <w:r>
               <w:rPr>
@@ -14116,11 +14154,17 @@
               <w:right w:w="35" w:type="dxa"/>
             </w:tcMar>
             <w:shd w:fill="FFFFFF"/>
-          </w:tcPr>
-          <w:p>
-            <w:pPr>
-              <w:spacing w:before="20" w:after="20" w:line="240" w:lineRule="auto"/>
-              <w:jc w:val="center"/>
+            <w:tcMar>
+              <w:top w:w="28" w:type="dxa"/>
+              <w:bottom w:w="28" w:type="dxa"/>
+              <w:left w:w="35" w:type="dxa"/>
+              <w:right w:w="35" w:type="dxa"/>
+            </w:tcMar>
+            <w:shd w:fill="FFFFFF"/>
+          </w:tcPr>
+          <w:p>
+            <w:pPr>
+              <w:spacing w:before="20" w:after="20" w:line="240" w:lineRule="auto"/>
             </w:pPr>
             <w:r>
               <w:rPr>
@@ -14148,11 +14192,17 @@
               <w:right w:w="35" w:type="dxa"/>
             </w:tcMar>
             <w:shd w:fill="FFFFFF"/>
-          </w:tcPr>
-          <w:p>
-            <w:pPr>
-              <w:spacing w:before="20" w:after="20" w:line="240" w:lineRule="auto"/>
-              <w:jc w:val="center"/>
+            <w:tcMar>
+              <w:top w:w="28" w:type="dxa"/>
+              <w:bottom w:w="28" w:type="dxa"/>
+              <w:left w:w="35" w:type="dxa"/>
+              <w:right w:w="35" w:type="dxa"/>
+            </w:tcMar>
+            <w:shd w:fill="FFFFFF"/>
+          </w:tcPr>
+          <w:p>
+            <w:pPr>
+              <w:spacing w:before="20" w:after="20" w:line="240" w:lineRule="auto"/>
             </w:pPr>
             <w:r>
               <w:rPr>
@@ -14180,11 +14230,17 @@
               <w:right w:w="35" w:type="dxa"/>
             </w:tcMar>
             <w:shd w:fill="FFFFFF"/>
-          </w:tcPr>
-          <w:p>
-            <w:pPr>
-              <w:spacing w:before="20" w:after="20" w:line="240" w:lineRule="auto"/>
-              <w:jc w:val="center"/>
+            <w:tcMar>
+              <w:top w:w="28" w:type="dxa"/>
+              <w:bottom w:w="28" w:type="dxa"/>
+              <w:left w:w="35" w:type="dxa"/>
+              <w:right w:w="35" w:type="dxa"/>
+            </w:tcMar>
+            <w:shd w:fill="FFFFFF"/>
+          </w:tcPr>
+          <w:p>
+            <w:pPr>
+              <w:spacing w:before="20" w:after="20" w:line="240" w:lineRule="auto"/>
             </w:pPr>
             <w:r>
               <w:rPr>
@@ -14212,11 +14268,17 @@
               <w:right w:w="35" w:type="dxa"/>
             </w:tcMar>
             <w:shd w:fill="FFFFFF"/>
-          </w:tcPr>
-          <w:p>
-            <w:pPr>
-              <w:spacing w:before="20" w:after="20" w:line="240" w:lineRule="auto"/>
-              <w:jc w:val="center"/>
+            <w:tcMar>
+              <w:top w:w="28" w:type="dxa"/>
+              <w:bottom w:w="28" w:type="dxa"/>
+              <w:left w:w="35" w:type="dxa"/>
+              <w:right w:w="35" w:type="dxa"/>
+            </w:tcMar>
+            <w:shd w:fill="FFFFFF"/>
+          </w:tcPr>
+          <w:p>
+            <w:pPr>
+              <w:spacing w:before="20" w:after="20" w:line="240" w:lineRule="auto"/>
             </w:pPr>
             <w:r>
               <w:rPr>
@@ -14244,11 +14306,17 @@
               <w:right w:w="35" w:type="dxa"/>
             </w:tcMar>
             <w:shd w:fill="FFFFFF"/>
-          </w:tcPr>
-          <w:p>
-            <w:pPr>
-              <w:spacing w:before="20" w:after="20" w:line="240" w:lineRule="auto"/>
-              <w:jc w:val="center"/>
+            <w:tcMar>
+              <w:top w:w="28" w:type="dxa"/>
+              <w:bottom w:w="28" w:type="dxa"/>
+              <w:left w:w="35" w:type="dxa"/>
+              <w:right w:w="35" w:type="dxa"/>
+            </w:tcMar>
+            <w:shd w:fill="FFFFFF"/>
+          </w:tcPr>
+          <w:p>
+            <w:pPr>
+              <w:spacing w:before="20" w:after="20" w:line="240" w:lineRule="auto"/>
             </w:pPr>
             <w:r>
               <w:rPr>
@@ -14276,11 +14344,17 @@
               <w:right w:w="35" w:type="dxa"/>
             </w:tcMar>
             <w:shd w:fill="FFFFFF"/>
-          </w:tcPr>
-          <w:p>
-            <w:pPr>
-              <w:spacing w:before="20" w:after="20" w:line="240" w:lineRule="auto"/>
-              <w:jc w:val="center"/>
+            <w:tcMar>
+              <w:top w:w="28" w:type="dxa"/>
+              <w:bottom w:w="28" w:type="dxa"/>
+              <w:left w:w="35" w:type="dxa"/>
+              <w:right w:w="35" w:type="dxa"/>
+            </w:tcMar>
+            <w:shd w:fill="FFFFFF"/>
+          </w:tcPr>
+          <w:p>
+            <w:pPr>
+              <w:spacing w:before="20" w:after="20" w:line="240" w:lineRule="auto"/>
             </w:pPr>
             <w:r>
               <w:rPr>
@@ -14289,38 +14363,6 @@
                 <w:sz w:val="14"/>
               </w:rPr>
               <w:t>Vulnerable to unnormalized syntax</w:t>
-            </w:r>
-          </w:p>
-        </w:tc>
-        <w:tc>
-          <w:tcPr>
-            <w:tcW w:type="dxa" w:w="1152"/>
-            <w:tcMar>
-              <w:top w:w="35" w:type="dxa"/>
-              <w:bottom w:w="35" w:type="dxa"/>
-              <w:left w:w="45" w:type="dxa"/>
-              <w:right w:w="45" w:type="dxa"/>
-            </w:tcMar>
-            <w:tcMar>
-              <w:top w:w="28" w:type="dxa"/>
-              <w:bottom w:w="28" w:type="dxa"/>
-              <w:left w:w="35" w:type="dxa"/>
-              <w:right w:w="35" w:type="dxa"/>
-            </w:tcMar>
-            <w:shd w:fill="FFFFFF"/>
-          </w:tcPr>
-          <w:p>
-            <w:pPr>
-              <w:spacing w:line="240" w:lineRule="auto" w:before="20" w:after="20"/>
-              <w:jc w:val="center"/>
-            </w:pPr>
-            <w:r>
-              <w:rPr>
-                <w:rFonts w:ascii="Times New Roman" w:hAnsi="Times New Roman"/>
-                <w:color w:val="1E293B"/>
-                <w:sz w:val="14"/>
-              </w:rPr>
-              <w:t>0.00%</w:t>
             </w:r>
           </w:p>
         </w:tc>
@@ -14343,16 +14385,21 @@
               <w:right w:w="35" w:type="dxa"/>
             </w:tcMar>
             <w:shd w:fill="F7FAFC"/>
-          </w:tcPr>
-          <w:p>
-            <w:pPr>
-              <w:spacing w:before="20" w:after="20" w:line="240" w:lineRule="auto"/>
-              <w:jc w:val="left"/>
-            </w:pPr>
-            <w:r>
-              <w:rPr>
-                <w:rFonts w:ascii="Times New Roman" w:hAnsi="Times New Roman"/>
-                <w:b/>
+            <w:tcMar>
+              <w:top w:w="28" w:type="dxa"/>
+              <w:bottom w:w="28" w:type="dxa"/>
+              <w:left w:w="35" w:type="dxa"/>
+              <w:right w:w="35" w:type="dxa"/>
+            </w:tcMar>
+            <w:shd w:fill="F7FAFC"/>
+          </w:tcPr>
+          <w:p>
+            <w:pPr>
+              <w:spacing w:before="20" w:after="20" w:line="240" w:lineRule="auto"/>
+            </w:pPr>
+            <w:r>
+              <w:rPr>
+                <w:rFonts w:ascii="Times New Roman" w:hAnsi="Times New Roman"/>
                 <w:color w:val="1E293B"/>
                 <w:sz w:val="14"/>
               </w:rPr>
@@ -14377,11 +14424,17 @@
               <w:right w:w="35" w:type="dxa"/>
             </w:tcMar>
             <w:shd w:fill="F7FAFC"/>
-          </w:tcPr>
-          <w:p>
-            <w:pPr>
-              <w:spacing w:before="20" w:after="20" w:line="240" w:lineRule="auto"/>
-              <w:jc w:val="center"/>
+            <w:tcMar>
+              <w:top w:w="28" w:type="dxa"/>
+              <w:bottom w:w="28" w:type="dxa"/>
+              <w:left w:w="35" w:type="dxa"/>
+              <w:right w:w="35" w:type="dxa"/>
+            </w:tcMar>
+            <w:shd w:fill="F7FAFC"/>
+          </w:tcPr>
+          <w:p>
+            <w:pPr>
+              <w:spacing w:before="20" w:after="20" w:line="240" w:lineRule="auto"/>
             </w:pPr>
             <w:r>
               <w:rPr>
@@ -14410,11 +14463,17 @@
               <w:right w:w="35" w:type="dxa"/>
             </w:tcMar>
             <w:shd w:fill="F7FAFC"/>
-          </w:tcPr>
-          <w:p>
-            <w:pPr>
-              <w:spacing w:before="20" w:after="20" w:line="240" w:lineRule="auto"/>
-              <w:jc w:val="center"/>
+            <w:tcMar>
+              <w:top w:w="28" w:type="dxa"/>
+              <w:bottom w:w="28" w:type="dxa"/>
+              <w:left w:w="35" w:type="dxa"/>
+              <w:right w:w="35" w:type="dxa"/>
+            </w:tcMar>
+            <w:shd w:fill="F7FAFC"/>
+          </w:tcPr>
+          <w:p>
+            <w:pPr>
+              <w:spacing w:before="20" w:after="20" w:line="240" w:lineRule="auto"/>
             </w:pPr>
             <w:r>
               <w:rPr>
@@ -14443,11 +14502,17 @@
               <w:right w:w="35" w:type="dxa"/>
             </w:tcMar>
             <w:shd w:fill="F7FAFC"/>
-          </w:tcPr>
-          <w:p>
-            <w:pPr>
-              <w:spacing w:before="20" w:after="20" w:line="240" w:lineRule="auto"/>
-              <w:jc w:val="center"/>
+            <w:tcMar>
+              <w:top w:w="28" w:type="dxa"/>
+              <w:bottom w:w="28" w:type="dxa"/>
+              <w:left w:w="35" w:type="dxa"/>
+              <w:right w:w="35" w:type="dxa"/>
+            </w:tcMar>
+            <w:shd w:fill="F7FAFC"/>
+          </w:tcPr>
+          <w:p>
+            <w:pPr>
+              <w:spacing w:before="20" w:after="20" w:line="240" w:lineRule="auto"/>
             </w:pPr>
             <w:r>
               <w:rPr>
@@ -14476,11 +14541,17 @@
               <w:right w:w="35" w:type="dxa"/>
             </w:tcMar>
             <w:shd w:fill="F7FAFC"/>
-          </w:tcPr>
-          <w:p>
-            <w:pPr>
-              <w:spacing w:before="20" w:after="20" w:line="240" w:lineRule="auto"/>
-              <w:jc w:val="center"/>
+            <w:tcMar>
+              <w:top w:w="28" w:type="dxa"/>
+              <w:bottom w:w="28" w:type="dxa"/>
+              <w:left w:w="35" w:type="dxa"/>
+              <w:right w:w="35" w:type="dxa"/>
+            </w:tcMar>
+            <w:shd w:fill="F7FAFC"/>
+          </w:tcPr>
+          <w:p>
+            <w:pPr>
+              <w:spacing w:before="20" w:after="20" w:line="240" w:lineRule="auto"/>
             </w:pPr>
             <w:r>
               <w:rPr>
@@ -14509,11 +14580,17 @@
               <w:right w:w="35" w:type="dxa"/>
             </w:tcMar>
             <w:shd w:fill="F7FAFC"/>
-          </w:tcPr>
-          <w:p>
-            <w:pPr>
-              <w:spacing w:before="20" w:after="20" w:line="240" w:lineRule="auto"/>
-              <w:jc w:val="center"/>
+            <w:tcMar>
+              <w:top w:w="28" w:type="dxa"/>
+              <w:bottom w:w="28" w:type="dxa"/>
+              <w:left w:w="35" w:type="dxa"/>
+              <w:right w:w="35" w:type="dxa"/>
+            </w:tcMar>
+            <w:shd w:fill="F7FAFC"/>
+          </w:tcPr>
+          <w:p>
+            <w:pPr>
+              <w:spacing w:before="20" w:after="20" w:line="240" w:lineRule="auto"/>
             </w:pPr>
             <w:r>
               <w:rPr>
@@ -14542,11 +14619,17 @@
               <w:right w:w="35" w:type="dxa"/>
             </w:tcMar>
             <w:shd w:fill="F7FAFC"/>
-          </w:tcPr>
-          <w:p>
-            <w:pPr>
-              <w:spacing w:before="20" w:after="20" w:line="240" w:lineRule="auto"/>
-              <w:jc w:val="center"/>
+            <w:tcMar>
+              <w:top w:w="28" w:type="dxa"/>
+              <w:bottom w:w="28" w:type="dxa"/>
+              <w:left w:w="35" w:type="dxa"/>
+              <w:right w:w="35" w:type="dxa"/>
+            </w:tcMar>
+            <w:shd w:fill="F7FAFC"/>
+          </w:tcPr>
+          <w:p>
+            <w:pPr>
+              <w:spacing w:before="20" w:after="20" w:line="240" w:lineRule="auto"/>
             </w:pPr>
             <w:r>
               <w:rPr>
@@ -14575,11 +14658,17 @@
               <w:right w:w="35" w:type="dxa"/>
             </w:tcMar>
             <w:shd w:fill="F7FAFC"/>
-          </w:tcPr>
-          <w:p>
-            <w:pPr>
-              <w:spacing w:before="20" w:after="20" w:line="240" w:lineRule="auto"/>
-              <w:jc w:val="center"/>
+            <w:tcMar>
+              <w:top w:w="28" w:type="dxa"/>
+              <w:bottom w:w="28" w:type="dxa"/>
+              <w:left w:w="35" w:type="dxa"/>
+              <w:right w:w="35" w:type="dxa"/>
+            </w:tcMar>
+            <w:shd w:fill="F7FAFC"/>
+          </w:tcPr>
+          <w:p>
+            <w:pPr>
+              <w:spacing w:before="20" w:after="20" w:line="240" w:lineRule="auto"/>
             </w:pPr>
             <w:r>
               <w:rPr>
@@ -14588,39 +14677,6 @@
                 <w:sz w:val="14"/>
               </w:rPr>
               <w:t>Degrades under severe 90° rotation</w:t>
-            </w:r>
-          </w:p>
-        </w:tc>
-        <w:tc>
-          <w:tcPr>
-            <w:tcW w:type="dxa" w:w="1152"/>
-            <w:tcMar>
-              <w:top w:w="35" w:type="dxa"/>
-              <w:bottom w:w="35" w:type="dxa"/>
-              <w:left w:w="45" w:type="dxa"/>
-              <w:right w:w="45" w:type="dxa"/>
-            </w:tcMar>
-            <w:shd w:fill="F8F9FA"/>
-            <w:tcMar>
-              <w:top w:w="28" w:type="dxa"/>
-              <w:bottom w:w="28" w:type="dxa"/>
-              <w:left w:w="35" w:type="dxa"/>
-              <w:right w:w="35" w:type="dxa"/>
-            </w:tcMar>
-            <w:shd w:fill="F7FAFC"/>
-          </w:tcPr>
-          <w:p>
-            <w:pPr>
-              <w:spacing w:line="240" w:lineRule="auto" w:before="20" w:after="20"/>
-              <w:jc w:val="center"/>
-            </w:pPr>
-            <w:r>
-              <w:rPr>
-                <w:rFonts w:ascii="Times New Roman" w:hAnsi="Times New Roman"/>
-                <w:color w:val="1E293B"/>
-                <w:sz w:val="14"/>
-              </w:rPr>
-              <w:t>0.00%</w:t>
             </w:r>
           </w:p>
         </w:tc>
@@ -14642,16 +14698,21 @@
               <w:right w:w="35" w:type="dxa"/>
             </w:tcMar>
             <w:shd w:fill="FFFFFF"/>
-          </w:tcPr>
-          <w:p>
-            <w:pPr>
-              <w:spacing w:before="20" w:after="20" w:line="240" w:lineRule="auto"/>
-              <w:jc w:val="left"/>
-            </w:pPr>
-            <w:r>
-              <w:rPr>
-                <w:rFonts w:ascii="Times New Roman" w:hAnsi="Times New Roman"/>
-                <w:b/>
+            <w:tcMar>
+              <w:top w:w="28" w:type="dxa"/>
+              <w:bottom w:w="28" w:type="dxa"/>
+              <w:left w:w="35" w:type="dxa"/>
+              <w:right w:w="35" w:type="dxa"/>
+            </w:tcMar>
+            <w:shd w:fill="FFFFFF"/>
+          </w:tcPr>
+          <w:p>
+            <w:pPr>
+              <w:spacing w:before="20" w:after="20" w:line="240" w:lineRule="auto"/>
+            </w:pPr>
+            <w:r>
+              <w:rPr>
+                <w:rFonts w:ascii="Times New Roman" w:hAnsi="Times New Roman"/>
                 <w:color w:val="1E293B"/>
                 <w:sz w:val="14"/>
               </w:rPr>
@@ -14675,11 +14736,17 @@
               <w:right w:w="35" w:type="dxa"/>
             </w:tcMar>
             <w:shd w:fill="FFFFFF"/>
-          </w:tcPr>
-          <w:p>
-            <w:pPr>
-              <w:spacing w:before="20" w:after="20" w:line="240" w:lineRule="auto"/>
-              <w:jc w:val="center"/>
+            <w:tcMar>
+              <w:top w:w="28" w:type="dxa"/>
+              <w:bottom w:w="28" w:type="dxa"/>
+              <w:left w:w="35" w:type="dxa"/>
+              <w:right w:w="35" w:type="dxa"/>
+            </w:tcMar>
+            <w:shd w:fill="FFFFFF"/>
+          </w:tcPr>
+          <w:p>
+            <w:pPr>
+              <w:spacing w:before="20" w:after="20" w:line="240" w:lineRule="auto"/>
             </w:pPr>
             <w:r>
               <w:rPr>
@@ -14707,11 +14774,17 @@
               <w:right w:w="35" w:type="dxa"/>
             </w:tcMar>
             <w:shd w:fill="FFFFFF"/>
-          </w:tcPr>
-          <w:p>
-            <w:pPr>
-              <w:spacing w:before="20" w:after="20" w:line="240" w:lineRule="auto"/>
-              <w:jc w:val="center"/>
+            <w:tcMar>
+              <w:top w:w="28" w:type="dxa"/>
+              <w:bottom w:w="28" w:type="dxa"/>
+              <w:left w:w="35" w:type="dxa"/>
+              <w:right w:w="35" w:type="dxa"/>
+            </w:tcMar>
+            <w:shd w:fill="FFFFFF"/>
+          </w:tcPr>
+          <w:p>
+            <w:pPr>
+              <w:spacing w:before="20" w:after="20" w:line="240" w:lineRule="auto"/>
             </w:pPr>
             <w:r>
               <w:rPr>
@@ -14739,11 +14812,17 @@
               <w:right w:w="35" w:type="dxa"/>
             </w:tcMar>
             <w:shd w:fill="FFFFFF"/>
-          </w:tcPr>
-          <w:p>
-            <w:pPr>
-              <w:spacing w:before="20" w:after="20" w:line="240" w:lineRule="auto"/>
-              <w:jc w:val="center"/>
+            <w:tcMar>
+              <w:top w:w="28" w:type="dxa"/>
+              <w:bottom w:w="28" w:type="dxa"/>
+              <w:left w:w="35" w:type="dxa"/>
+              <w:right w:w="35" w:type="dxa"/>
+            </w:tcMar>
+            <w:shd w:fill="FFFFFF"/>
+          </w:tcPr>
+          <w:p>
+            <w:pPr>
+              <w:spacing w:before="20" w:after="20" w:line="240" w:lineRule="auto"/>
             </w:pPr>
             <w:r>
               <w:rPr>
@@ -14771,11 +14850,17 @@
               <w:right w:w="35" w:type="dxa"/>
             </w:tcMar>
             <w:shd w:fill="FFFFFF"/>
-          </w:tcPr>
-          <w:p>
-            <w:pPr>
-              <w:spacing w:before="20" w:after="20" w:line="240" w:lineRule="auto"/>
-              <w:jc w:val="center"/>
+            <w:tcMar>
+              <w:top w:w="28" w:type="dxa"/>
+              <w:bottom w:w="28" w:type="dxa"/>
+              <w:left w:w="35" w:type="dxa"/>
+              <w:right w:w="35" w:type="dxa"/>
+            </w:tcMar>
+            <w:shd w:fill="FFFFFF"/>
+          </w:tcPr>
+          <w:p>
+            <w:pPr>
+              <w:spacing w:before="20" w:after="20" w:line="240" w:lineRule="auto"/>
             </w:pPr>
             <w:r>
               <w:rPr>
@@ -14803,11 +14888,17 @@
               <w:right w:w="35" w:type="dxa"/>
             </w:tcMar>
             <w:shd w:fill="FFFFFF"/>
-          </w:tcPr>
-          <w:p>
-            <w:pPr>
-              <w:spacing w:before="20" w:after="20" w:line="240" w:lineRule="auto"/>
-              <w:jc w:val="center"/>
+            <w:tcMar>
+              <w:top w:w="28" w:type="dxa"/>
+              <w:bottom w:w="28" w:type="dxa"/>
+              <w:left w:w="35" w:type="dxa"/>
+              <w:right w:w="35" w:type="dxa"/>
+            </w:tcMar>
+            <w:shd w:fill="FFFFFF"/>
+          </w:tcPr>
+          <w:p>
+            <w:pPr>
+              <w:spacing w:before="20" w:after="20" w:line="240" w:lineRule="auto"/>
             </w:pPr>
             <w:r>
               <w:rPr>
@@ -14835,11 +14926,17 @@
               <w:right w:w="35" w:type="dxa"/>
             </w:tcMar>
             <w:shd w:fill="FFFFFF"/>
-          </w:tcPr>
-          <w:p>
-            <w:pPr>
-              <w:spacing w:before="20" w:after="20" w:line="240" w:lineRule="auto"/>
-              <w:jc w:val="center"/>
+            <w:tcMar>
+              <w:top w:w="28" w:type="dxa"/>
+              <w:bottom w:w="28" w:type="dxa"/>
+              <w:left w:w="35" w:type="dxa"/>
+              <w:right w:w="35" w:type="dxa"/>
+            </w:tcMar>
+            <w:shd w:fill="FFFFFF"/>
+          </w:tcPr>
+          <w:p>
+            <w:pPr>
+              <w:spacing w:before="20" w:after="20" w:line="240" w:lineRule="auto"/>
             </w:pPr>
             <w:r>
               <w:rPr>
@@ -14867,11 +14964,17 @@
               <w:right w:w="35" w:type="dxa"/>
             </w:tcMar>
             <w:shd w:fill="FFFFFF"/>
-          </w:tcPr>
-          <w:p>
-            <w:pPr>
-              <w:spacing w:before="20" w:after="20" w:line="240" w:lineRule="auto"/>
-              <w:jc w:val="center"/>
+            <w:tcMar>
+              <w:top w:w="28" w:type="dxa"/>
+              <w:bottom w:w="28" w:type="dxa"/>
+              <w:left w:w="35" w:type="dxa"/>
+              <w:right w:w="35" w:type="dxa"/>
+            </w:tcMar>
+            <w:shd w:fill="FFFFFF"/>
+          </w:tcPr>
+          <w:p>
+            <w:pPr>
+              <w:spacing w:before="20" w:after="20" w:line="240" w:lineRule="auto"/>
             </w:pPr>
             <w:r>
               <w:rPr>
@@ -14880,38 +14983,6 @@
                 <w:sz w:val="14"/>
               </w:rPr>
               <w:t>Live neural evaluation across 900 fields</w:t>
-            </w:r>
-          </w:p>
-        </w:tc>
-        <w:tc>
-          <w:tcPr>
-            <w:tcW w:type="dxa" w:w="1152"/>
-            <w:tcMar>
-              <w:top w:w="35" w:type="dxa"/>
-              <w:bottom w:w="35" w:type="dxa"/>
-              <w:left w:w="45" w:type="dxa"/>
-              <w:right w:w="45" w:type="dxa"/>
-            </w:tcMar>
-            <w:tcMar>
-              <w:top w:w="28" w:type="dxa"/>
-              <w:bottom w:w="28" w:type="dxa"/>
-              <w:left w:w="35" w:type="dxa"/>
-              <w:right w:w="35" w:type="dxa"/>
-            </w:tcMar>
-            <w:shd w:fill="FFFFFF"/>
-          </w:tcPr>
-          <w:p>
-            <w:pPr>
-              <w:spacing w:line="240" w:lineRule="auto" w:before="20" w:after="20"/>
-              <w:jc w:val="center"/>
-            </w:pPr>
-            <w:r>
-              <w:rPr>
-                <w:rFonts w:ascii="Times New Roman" w:hAnsi="Times New Roman"/>
-                <w:color w:val="1E293B"/>
-                <w:sz w:val="14"/>
-              </w:rPr>
-              <w:t>0.00%</w:t>
             </w:r>
           </w:p>
         </w:tc>
@@ -14934,16 +15005,21 @@
               <w:right w:w="35" w:type="dxa"/>
             </w:tcMar>
             <w:shd w:fill="F7FAFC"/>
-          </w:tcPr>
-          <w:p>
-            <w:pPr>
-              <w:spacing w:before="20" w:after="20" w:line="240" w:lineRule="auto"/>
-              <w:jc w:val="left"/>
-            </w:pPr>
-            <w:r>
-              <w:rPr>
-                <w:rFonts w:ascii="Times New Roman" w:hAnsi="Times New Roman"/>
-                <w:b/>
+            <w:tcMar>
+              <w:top w:w="28" w:type="dxa"/>
+              <w:bottom w:w="28" w:type="dxa"/>
+              <w:left w:w="35" w:type="dxa"/>
+              <w:right w:w="35" w:type="dxa"/>
+            </w:tcMar>
+            <w:shd w:fill="F7FAFC"/>
+          </w:tcPr>
+          <w:p>
+            <w:pPr>
+              <w:spacing w:before="20" w:after="20" w:line="240" w:lineRule="auto"/>
+            </w:pPr>
+            <w:r>
+              <w:rPr>
+                <w:rFonts w:ascii="Times New Roman" w:hAnsi="Times New Roman"/>
                 <w:color w:val="1E293B"/>
                 <w:sz w:val="14"/>
               </w:rPr>
@@ -14968,16 +15044,21 @@
               <w:right w:w="35" w:type="dxa"/>
             </w:tcMar>
             <w:shd w:fill="F7FAFC"/>
-          </w:tcPr>
-          <w:p>
-            <w:pPr>
-              <w:spacing w:before="20" w:after="20" w:line="240" w:lineRule="auto"/>
-              <w:jc w:val="center"/>
-            </w:pPr>
-            <w:r>
-              <w:rPr>
-                <w:rFonts w:ascii="Times New Roman" w:hAnsi="Times New Roman"/>
-                <w:b/>
+            <w:tcMar>
+              <w:top w:w="28" w:type="dxa"/>
+              <w:bottom w:w="28" w:type="dxa"/>
+              <w:left w:w="35" w:type="dxa"/>
+              <w:right w:w="35" w:type="dxa"/>
+            </w:tcMar>
+            <w:shd w:fill="F7FAFC"/>
+          </w:tcPr>
+          <w:p>
+            <w:pPr>
+              <w:spacing w:before="20" w:after="20" w:line="240" w:lineRule="auto"/>
+            </w:pPr>
+            <w:r>
+              <w:rPr>
+                <w:rFonts w:ascii="Times New Roman" w:hAnsi="Times New Roman"/>
                 <w:color w:val="1E293B"/>
                 <w:sz w:val="14"/>
               </w:rPr>
@@ -15002,16 +15083,21 @@
               <w:right w:w="35" w:type="dxa"/>
             </w:tcMar>
             <w:shd w:fill="F7FAFC"/>
-          </w:tcPr>
-          <w:p>
-            <w:pPr>
-              <w:spacing w:before="20" w:after="20" w:line="240" w:lineRule="auto"/>
-              <w:jc w:val="center"/>
-            </w:pPr>
-            <w:r>
-              <w:rPr>
-                <w:rFonts w:ascii="Times New Roman" w:hAnsi="Times New Roman"/>
-                <w:b/>
+            <w:tcMar>
+              <w:top w:w="28" w:type="dxa"/>
+              <w:bottom w:w="28" w:type="dxa"/>
+              <w:left w:w="35" w:type="dxa"/>
+              <w:right w:w="35" w:type="dxa"/>
+            </w:tcMar>
+            <w:shd w:fill="F7FAFC"/>
+          </w:tcPr>
+          <w:p>
+            <w:pPr>
+              <w:spacing w:before="20" w:after="20" w:line="240" w:lineRule="auto"/>
+            </w:pPr>
+            <w:r>
+              <w:rPr>
+                <w:rFonts w:ascii="Times New Roman" w:hAnsi="Times New Roman"/>
                 <w:color w:val="1E293B"/>
                 <w:sz w:val="14"/>
               </w:rPr>
@@ -15036,16 +15122,21 @@
               <w:right w:w="35" w:type="dxa"/>
             </w:tcMar>
             <w:shd w:fill="F7FAFC"/>
-          </w:tcPr>
-          <w:p>
-            <w:pPr>
-              <w:spacing w:before="20" w:after="20" w:line="240" w:lineRule="auto"/>
-              <w:jc w:val="center"/>
-            </w:pPr>
-            <w:r>
-              <w:rPr>
-                <w:rFonts w:ascii="Times New Roman" w:hAnsi="Times New Roman"/>
-                <w:b/>
+            <w:tcMar>
+              <w:top w:w="28" w:type="dxa"/>
+              <w:bottom w:w="28" w:type="dxa"/>
+              <w:left w:w="35" w:type="dxa"/>
+              <w:right w:w="35" w:type="dxa"/>
+            </w:tcMar>
+            <w:shd w:fill="F7FAFC"/>
+          </w:tcPr>
+          <w:p>
+            <w:pPr>
+              <w:spacing w:before="20" w:after="20" w:line="240" w:lineRule="auto"/>
+            </w:pPr>
+            <w:r>
+              <w:rPr>
+                <w:rFonts w:ascii="Times New Roman" w:hAnsi="Times New Roman"/>
                 <w:color w:val="1E293B"/>
                 <w:sz w:val="14"/>
               </w:rPr>
@@ -15070,16 +15161,21 @@
               <w:right w:w="35" w:type="dxa"/>
             </w:tcMar>
             <w:shd w:fill="F7FAFC"/>
-          </w:tcPr>
-          <w:p>
-            <w:pPr>
-              <w:spacing w:before="20" w:after="20" w:line="240" w:lineRule="auto"/>
-              <w:jc w:val="center"/>
-            </w:pPr>
-            <w:r>
-              <w:rPr>
-                <w:rFonts w:ascii="Times New Roman" w:hAnsi="Times New Roman"/>
-                <w:b/>
+            <w:tcMar>
+              <w:top w:w="28" w:type="dxa"/>
+              <w:bottom w:w="28" w:type="dxa"/>
+              <w:left w:w="35" w:type="dxa"/>
+              <w:right w:w="35" w:type="dxa"/>
+            </w:tcMar>
+            <w:shd w:fill="F7FAFC"/>
+          </w:tcPr>
+          <w:p>
+            <w:pPr>
+              <w:spacing w:before="20" w:after="20" w:line="240" w:lineRule="auto"/>
+            </w:pPr>
+            <w:r>
+              <w:rPr>
+                <w:rFonts w:ascii="Times New Roman" w:hAnsi="Times New Roman"/>
                 <w:color w:val="1E293B"/>
                 <w:sz w:val="14"/>
               </w:rPr>
@@ -15104,16 +15200,21 @@
               <w:right w:w="35" w:type="dxa"/>
             </w:tcMar>
             <w:shd w:fill="F7FAFC"/>
-          </w:tcPr>
-          <w:p>
-            <w:pPr>
-              <w:spacing w:before="20" w:after="20" w:line="240" w:lineRule="auto"/>
-              <w:jc w:val="center"/>
-            </w:pPr>
-            <w:r>
-              <w:rPr>
-                <w:rFonts w:ascii="Times New Roman" w:hAnsi="Times New Roman"/>
-                <w:b/>
+            <w:tcMar>
+              <w:top w:w="28" w:type="dxa"/>
+              <w:bottom w:w="28" w:type="dxa"/>
+              <w:left w:w="35" w:type="dxa"/>
+              <w:right w:w="35" w:type="dxa"/>
+            </w:tcMar>
+            <w:shd w:fill="F7FAFC"/>
+          </w:tcPr>
+          <w:p>
+            <w:pPr>
+              <w:spacing w:before="20" w:after="20" w:line="240" w:lineRule="auto"/>
+            </w:pPr>
+            <w:r>
+              <w:rPr>
+                <w:rFonts w:ascii="Times New Roman" w:hAnsi="Times New Roman"/>
                 <w:color w:val="1E293B"/>
                 <w:sz w:val="14"/>
               </w:rPr>
@@ -15138,16 +15239,21 @@
               <w:right w:w="35" w:type="dxa"/>
             </w:tcMar>
             <w:shd w:fill="F7FAFC"/>
-          </w:tcPr>
-          <w:p>
-            <w:pPr>
-              <w:spacing w:before="20" w:after="20" w:line="240" w:lineRule="auto"/>
-              <w:jc w:val="center"/>
-            </w:pPr>
-            <w:r>
-              <w:rPr>
-                <w:rFonts w:ascii="Times New Roman" w:hAnsi="Times New Roman"/>
-                <w:b/>
+            <w:tcMar>
+              <w:top w:w="28" w:type="dxa"/>
+              <w:bottom w:w="28" w:type="dxa"/>
+              <w:left w:w="35" w:type="dxa"/>
+              <w:right w:w="35" w:type="dxa"/>
+            </w:tcMar>
+            <w:shd w:fill="F7FAFC"/>
+          </w:tcPr>
+          <w:p>
+            <w:pPr>
+              <w:spacing w:before="20" w:after="20" w:line="240" w:lineRule="auto"/>
+            </w:pPr>
+            <w:r>
+              <w:rPr>
+                <w:rFonts w:ascii="Times New Roman" w:hAnsi="Times New Roman"/>
                 <w:color w:val="1E293B"/>
                 <w:sz w:val="14"/>
               </w:rPr>
@@ -15172,53 +15278,25 @@
               <w:right w:w="35" w:type="dxa"/>
             </w:tcMar>
             <w:shd w:fill="F7FAFC"/>
-          </w:tcPr>
-          <w:p>
-            <w:pPr>
-              <w:spacing w:before="20" w:after="20" w:line="240" w:lineRule="auto"/>
-              <w:jc w:val="center"/>
-            </w:pPr>
-            <w:r>
-              <w:rPr>
-                <w:rFonts w:ascii="Times New Roman" w:hAnsi="Times New Roman"/>
-                <w:b/>
+            <w:tcMar>
+              <w:top w:w="28" w:type="dxa"/>
+              <w:bottom w:w="28" w:type="dxa"/>
+              <w:left w:w="35" w:type="dxa"/>
+              <w:right w:w="35" w:type="dxa"/>
+            </w:tcMar>
+            <w:shd w:fill="F7FAFC"/>
+          </w:tcPr>
+          <w:p>
+            <w:pPr>
+              <w:spacing w:before="20" w:after="20" w:line="240" w:lineRule="auto"/>
+            </w:pPr>
+            <w:r>
+              <w:rPr>
+                <w:rFonts w:ascii="Times New Roman" w:hAnsi="Times New Roman"/>
                 <w:color w:val="1E293B"/>
                 <w:sz w:val="14"/>
               </w:rPr>
               <w:t>Live Verified State-of-the-Art (+11.00% Gain)</w:t>
-            </w:r>
-          </w:p>
-        </w:tc>
-        <w:tc>
-          <w:tcPr>
-            <w:tcW w:type="dxa" w:w="1152"/>
-            <w:tcMar>
-              <w:top w:w="35" w:type="dxa"/>
-              <w:bottom w:w="35" w:type="dxa"/>
-              <w:left w:w="45" w:type="dxa"/>
-              <w:right w:w="45" w:type="dxa"/>
-            </w:tcMar>
-            <w:shd w:fill="F8F9FA"/>
-            <w:tcMar>
-              <w:top w:w="28" w:type="dxa"/>
-              <w:bottom w:w="28" w:type="dxa"/>
-              <w:left w:w="35" w:type="dxa"/>
-              <w:right w:w="35" w:type="dxa"/>
-            </w:tcMar>
-            <w:shd w:fill="F7FAFC"/>
-          </w:tcPr>
-          <w:p>
-            <w:pPr>
-              <w:spacing w:line="240" w:lineRule="auto" w:before="20" w:after="20"/>
-              <w:jc w:val="center"/>
-            </w:pPr>
-            <w:r>
-              <w:rPr>
-                <w:rFonts w:ascii="Times New Roman" w:hAnsi="Times New Roman"/>
-                <w:color w:val="1E293B"/>
-                <w:sz w:val="14"/>
-              </w:rPr>
-              <w:t>0.00%</w:t>
             </w:r>
           </w:p>
         </w:tc>

</xml_diff>